<commit_message>
Add the cohort retrieval strategy and close the last STROBE gap
The search the author used: operative diagnosis naming intestinal
malrotation, or procedure recorded as a Ladd procedure. Replayed against
the raw operative records to give reproducible counts rather than a
narrative claim — 559 records in 499 children retrieved and reviewed, 503
records in 465 children meeting the criterion, with the 34 children not
returned carrying unrelated operative diagnoses. Verified in both
directions: no record inside the cohort fails the search, and no child
the search returns was excluded.

Methods carries the strategy and the counts, Fig. 1 gains the two boxes
above the cohort, and Online Resource 1 gains section G2 with the exact
fields and strings matched.

Main text 2,999 words.

Co-Authored-By: Claude Opus 5 <noreply@anthropic.com>
Claude-Session: https://claude.ai/code/session_013TkounLTBFVQRstE3VnhkM
</commit_message>
<xml_diff>
--- a/Online_Resource_1_NLP_and_report_audit.docx
+++ b/Online_Resource_1_NLP_and_report_audit.docx
@@ -410,6 +410,22 @@
       </w:pPr>
       <w:r>
         <w:t>Two limitations of this exercise should be stated. First, agreement is measured against labels that were themselves partly produced by rule-based classification, so it demonstrates that the published rules reproduce the analysis, not that either is correct against blinded image review. Second, the certainty tiers in Table 2 of the manuscript are computed over the adjudicated positive reports, whereas the reference implementation tiers its own positives; the two sets differ by the seventeen reports above, so tier counts differ by small numbers.</w:t>
+      </w:r>
+    </w:p>
+    <w:p>
+      <w:pPr>
+        <w:pStyle w:val="Heading1"/>
+      </w:pPr>
+      <w:r>
+        <w:t>G2. Cohort retrieval strings</w:t>
+      </w:r>
+    </w:p>
+    <w:p>
+      <w:pPr>
+        <w:spacing w:after="160"/>
+      </w:pPr>
+      <w:r>
+        <w:t>Children were retrieved from the institutional surgical records database by matching, case-insensitively, the operative diagnosis field (术中诊断) against `肠旋转不良` or the procedure-name field (手术名称) against `Ladd`. Applied to the 559 operative records of 499 children held for the study period, this returns 503 records in 465 children; every retrieved record was read before inclusion. The 34 children not returned had operative diagnoses unrelated to malrotation (appendicitis, hypertrophic pyloric stenosis, Hirschsprung disease, diaphragmatic and cardiac procedures among them).</w:t>
       </w:r>
     </w:p>
     <w:p>

</xml_diff>